<commit_message>
docs(crm): add workflow-activation action to the developer requirements
Co-Authored-By: Claude Fable 5.1 <noreply@anthropic.com>
Claude-Session: https://claude.ai/code/session_01VrpQxTs5Qi8BMFcWT6GSTG
</commit_message>
<xml_diff>
--- a/docs/CRM_DEVELOPER_REQUIREMENTS.docx
+++ b/docs/CRM_DEVELOPER_REQUIREMENTS.docx
@@ -150,6 +150,185 @@
           <w:szCs w:val="22"/>
         </w:rPr>
         <w:t xml:space="preserve">the CRM developer has shared the webhook and the four fields it needs (lead name, email, phone number, inquired project name). The website already sends exactly that. What remains is a short list of confirmations so nothing is guessed. Please answer every item; where one does not apply, write “N/A” with a one-line reason.</w:t>
+      </w:r>
+    </w:p>
+    <w:p>
+      <w:pPr>
+        <w:pStyle w:val="Heading1"/>
+        <w:spacing w:after="160" w:before="360"/>
+      </w:pPr>
+      <w:r>
+        <w:rPr>
+          <w:rFonts w:ascii="Calibri" w:cs="Calibri" w:eastAsia="Calibri" w:hAnsi="Calibri"/>
+          <w:b/>
+          <w:bCs/>
+          <w:color w:val="B42810"/>
+          <w:sz w:val="30"/>
+          <w:szCs w:val="30"/>
+        </w:rPr>
+        <w:t xml:space="preserve">0. Immediate action required — activate the workflow</w:t>
+      </w:r>
+    </w:p>
+    <w:p>
+      <w:pPr>
+        <w:spacing w:after="120" w:line="300"/>
+      </w:pPr>
+      <w:r>
+        <w:rPr>
+          <w:rFonts w:ascii="Calibri" w:cs="Calibri" w:eastAsia="Calibri" w:hAnsi="Calibri"/>
+          <w:color w:val="111111"/>
+          <w:sz w:val="22"/>
+          <w:szCs w:val="22"/>
+        </w:rPr>
+        <w:t xml:space="preserve">The webhook is currently </w:t>
+      </w:r>
+      <w:r>
+        <w:rPr>
+          <w:rFonts w:ascii="Calibri" w:cs="Calibri" w:eastAsia="Calibri" w:hAnsi="Calibri"/>
+          <w:b/>
+          <w:bCs/>
+          <w:color w:val="111111"/>
+          <w:sz w:val="22"/>
+          <w:szCs w:val="22"/>
+        </w:rPr>
+        <w:t xml:space="preserve">not live</w:t>
+      </w:r>
+      <w:r>
+        <w:rPr>
+          <w:rFonts w:ascii="Calibri" w:cs="Calibri" w:eastAsia="Calibri" w:hAnsi="Calibri"/>
+          <w:color w:val="111111"/>
+          <w:sz w:val="22"/>
+          <w:szCs w:val="22"/>
+        </w:rPr>
+        <w:t xml:space="preserve">. A test enquiry from the website on 7 September 2026 was rejected, and opening the URL directly returns n8n's “not registered” error:</w:t>
+      </w:r>
+    </w:p>
+    <w:p>
+      <w:pPr>
+        <w:shd w:fill="F4F4F4" w:color="auto" w:val="clear"/>
+        <w:spacing w:after="0" w:line="260"/>
+        <w:ind w:left="360"/>
+      </w:pPr>
+      <w:r>
+        <w:rPr>
+          <w:rFonts w:ascii="Consolas" w:cs="Consolas" w:eastAsia="Consolas" w:hAnsi="Consolas"/>
+          <w:color w:val="111111"/>
+          <w:sz w:val="18"/>
+          <w:szCs w:val="18"/>
+        </w:rPr>
+        <w:t xml:space="preserve">{"code":404,</w:t>
+      </w:r>
+    </w:p>
+    <w:p>
+      <w:pPr>
+        <w:shd w:fill="F4F4F4" w:color="auto" w:val="clear"/>
+        <w:spacing w:after="0" w:line="260"/>
+        <w:ind w:left="360"/>
+      </w:pPr>
+      <w:r>
+        <w:rPr>
+          <w:rFonts w:ascii="Consolas" w:cs="Consolas" w:eastAsia="Consolas" w:hAnsi="Consolas"/>
+          <w:color w:val="111111"/>
+          <w:sz w:val="18"/>
+          <w:szCs w:val="18"/>
+        </w:rPr>
+        <w:t xml:space="preserve"> "message":"The requested webhook \"GET yamuna-google-ads\" is not registered.",</w:t>
+      </w:r>
+    </w:p>
+    <w:p>
+      <w:pPr>
+        <w:shd w:fill="F4F4F4" w:color="auto" w:val="clear"/>
+        <w:spacing w:after="0" w:line="260"/>
+        <w:ind w:left="360"/>
+      </w:pPr>
+      <w:r>
+        <w:rPr>
+          <w:rFonts w:ascii="Consolas" w:cs="Consolas" w:eastAsia="Consolas" w:hAnsi="Consolas"/>
+          <w:color w:val="111111"/>
+          <w:sz w:val="18"/>
+          <w:szCs w:val="18"/>
+        </w:rPr>
+        <w:t xml:space="preserve"> "hint":"The workflow must be active for a production URL to run successfully. You can</w:t>
+      </w:r>
+    </w:p>
+    <w:p>
+      <w:pPr>
+        <w:shd w:fill="F4F4F4" w:color="auto" w:val="clear"/>
+        <w:spacing w:after="0" w:line="260"/>
+        <w:ind w:left="360"/>
+      </w:pPr>
+      <w:r>
+        <w:rPr>
+          <w:rFonts w:ascii="Consolas" w:cs="Consolas" w:eastAsia="Consolas" w:hAnsi="Consolas"/>
+          <w:color w:val="111111"/>
+          <w:sz w:val="18"/>
+          <w:szCs w:val="18"/>
+        </w:rPr>
+        <w:t xml:space="preserve">  activate the workflow using the toggle in the top-right of the editor. Note that unlike</w:t>
+      </w:r>
+    </w:p>
+    <w:p>
+      <w:pPr>
+        <w:shd w:fill="F4F4F4" w:color="auto" w:val="clear"/>
+        <w:spacing w:after="0" w:line="260"/>
+        <w:ind w:left="360"/>
+      </w:pPr>
+      <w:r>
+        <w:rPr>
+          <w:rFonts w:ascii="Consolas" w:cs="Consolas" w:eastAsia="Consolas" w:hAnsi="Consolas"/>
+          <w:color w:val="111111"/>
+          <w:sz w:val="18"/>
+          <w:szCs w:val="18"/>
+        </w:rPr>
+        <w:t xml:space="preserve">  test URL calls, production URL calls aren't shown on the canvas (only in the executions list)"}</w:t>
+      </w:r>
+    </w:p>
+    <w:p>
+      <w:pPr>
+        <w:spacing w:after="60"/>
+      </w:pPr>
+      <w:r>
+        <w:rPr>
+          <w:rFonts w:ascii="Calibri" w:cs="Calibri" w:eastAsia="Calibri" w:hAnsi="Calibri"/>
+          <w:color w:val="111111"/>
+          <w:sz w:val="22"/>
+          <w:szCs w:val="22"/>
+        </w:rPr>
+        <w:t xml:space="preserve"/>
+      </w:r>
+    </w:p>
+    <w:p>
+      <w:pPr>
+        <w:spacing w:after="120" w:line="300"/>
+      </w:pPr>
+      <w:r>
+        <w:rPr>
+          <w:rFonts w:ascii="Calibri" w:cs="Calibri" w:eastAsia="Calibri" w:hAnsi="Calibri"/>
+          <w:color w:val="111111"/>
+          <w:sz w:val="22"/>
+          <w:szCs w:val="22"/>
+        </w:rPr>
+        <w:t xml:space="preserve">This is n8n's message for a workflow that is switched off (an active workflow that simply does not accept GET says “not registered for GET requests” instead). </w:t>
+      </w:r>
+      <w:r>
+        <w:rPr>
+          <w:rFonts w:ascii="Calibri" w:cs="Calibri" w:eastAsia="Calibri" w:hAnsi="Calibri"/>
+          <w:b/>
+          <w:bCs/>
+          <w:color w:val="111111"/>
+          <w:sz w:val="22"/>
+          <w:szCs w:val="22"/>
+        </w:rPr>
+        <w:t xml:space="preserve">Please activate the workflow</w:t>
+      </w:r>
+      <w:r>
+        <w:rPr>
+          <w:rFonts w:ascii="Calibri" w:cs="Calibri" w:eastAsia="Calibri" w:hAnsi="Calibri"/>
+          <w:color w:val="111111"/>
+          <w:sz w:val="22"/>
+          <w:szCs w:val="22"/>
+        </w:rPr>
+        <w:t xml:space="preserve"> using the toggle in the top-right of the n8n editor so the production URL /webhook/yamuna-google-ads accepts requests, then let the website team know. The website will immediately start delivering leads — no change or redeploy is needed on the website side. Production calls appear in n8n's Executions list, not on the canvas.</w:t>
       </w:r>
     </w:p>
     <w:p>
@@ -5647,7 +5826,7 @@
           <w:sz w:val="22"/>
           <w:szCs w:val="22"/>
         </w:rPr>
-        <w:t xml:space="preserve">The website team sets the webhook URL in the hosting environment (server-side only) and redeploys.</w:t>
+        <w:t xml:space="preserve">The CRM developer activates the workflow (section 0). The webhook URL is already configured on the website's hosting environment.</w:t>
       </w:r>
     </w:p>
     <w:p>
@@ -5666,7 +5845,7 @@
           <w:sz w:val="22"/>
           <w:szCs w:val="22"/>
         </w:rPr>
-        <w:t xml:space="preserve">One clearly marked test enquiry is submitted from the live site; the CRM developer confirms it arrived with all four fields populated and deletes it.</w:t>
+        <w:t xml:space="preserve">One clearly marked test enquiry (“TEST - website”) is submitted from the live site; the CRM developer confirms it arrived with all four fields populated and deletes it.</w:t>
       </w:r>
     </w:p>
     <w:p>

</xml_diff>

<commit_message>
feat(leads): website-issued lead IDs and a CRM verdict column in the sheet
- Every lead gets a server-issued reference YSC-YYYYMMDD-XXXXXX, sent
  to the CRM (lead_id), written to the sheet (lead_id) and shown to the
  visitor on the thank-you screen.
- Delivery order is now CRM first, then the sheet row carrying the CRM
  verdict: noted_in_crm (real TRUE/FALSE, TRUE only when the CRM
  acknowledged the lead), crm_note (reason when FALSE), crm_lead_id,
  crm_checked_at. The sheet row is written whatever the CRM did; the
  Apps Script highlights FALSE cells.
- maxDuration 30 on the homepage so the sequential wait has headroom.
- Docs and the CRM developer requirements (md + docx) updated with the
  lead_id field.

Verified end to end across six CRM/sheet combinations: IDs match across
CRM payload, sheet row and UI; TRUE/FALSE and reasons correct.

Co-Authored-By: Claude Fable 5.1 <noreply@anthropic.com>
Claude-Session: https://claude.ai/code/session_01VrpQxTs5Qi8BMFcWT6GSTG
</commit_message>
<xml_diff>
--- a/docs/CRM_DEVELOPER_REQUIREMENTS.docx
+++ b/docs/CRM_DEVELOPER_REQUIREMENTS.docx
@@ -960,7 +960,7 @@
           <w:sz w:val="18"/>
           <w:szCs w:val="18"/>
         </w:rPr>
-        <w:t xml:space="preserve">  "name":    "Visitor name",</w:t>
+        <w:t xml:space="preserve">  "lead_id": "YSC-20260908-7K3Q9F",</w:t>
       </w:r>
     </w:p>
     <w:p>
@@ -976,7 +976,7 @@
           <w:sz w:val="18"/>
           <w:szCs w:val="18"/>
         </w:rPr>
-        <w:t xml:space="preserve">  "email":   "visitor@example.com",</w:t>
+        <w:t xml:space="preserve">  "name":    "Visitor name",</w:t>
       </w:r>
     </w:p>
     <w:p>
@@ -992,7 +992,7 @@
           <w:sz w:val="18"/>
           <w:szCs w:val="18"/>
         </w:rPr>
-        <w:t xml:space="preserve">  "phone":   "+91 98765 43210",</w:t>
+        <w:t xml:space="preserve">  "email":   "visitor@example.com",</w:t>
       </w:r>
     </w:p>
     <w:p>
@@ -1008,7 +1008,7 @@
           <w:sz w:val="18"/>
           <w:szCs w:val="18"/>
         </w:rPr>
-        <w:t xml:space="preserve">  "project": "Yamuna Sky City",</w:t>
+        <w:t xml:space="preserve">  "phone":   "+91 98765 43210",</w:t>
       </w:r>
     </w:p>
     <w:p>
@@ -1024,7 +1024,39 @@
           <w:sz w:val="18"/>
           <w:szCs w:val="18"/>
         </w:rPr>
+        <w:t xml:space="preserve">  "project": "Yamuna Sky City",</w:t>
+      </w:r>
+    </w:p>
+    <w:p>
+      <w:pPr>
+        <w:shd w:fill="F4F4F4" w:color="auto" w:val="clear"/>
+        <w:spacing w:after="0" w:line="260"/>
+        <w:ind w:left="360"/>
+      </w:pPr>
+      <w:r>
+        <w:rPr>
+          <w:rFonts w:ascii="Consolas" w:cs="Consolas" w:eastAsia="Consolas" w:hAnsi="Consolas"/>
+          <w:color w:val="111111"/>
+          <w:sz w:val="18"/>
+          <w:szCs w:val="18"/>
+        </w:rPr>
         <w:t xml:space="preserve">  "details": {</w:t>
+      </w:r>
+    </w:p>
+    <w:p>
+      <w:pPr>
+        <w:shd w:fill="F4F4F4" w:color="auto" w:val="clear"/>
+        <w:spacing w:after="0" w:line="260"/>
+        <w:ind w:left="360"/>
+      </w:pPr>
+      <w:r>
+        <w:rPr>
+          <w:rFonts w:ascii="Consolas" w:cs="Consolas" w:eastAsia="Consolas" w:hAnsi="Consolas"/>
+          <w:color w:val="111111"/>
+          <w:sz w:val="18"/>
+          <w:szCs w:val="18"/>
+        </w:rPr>
+        <w:t xml:space="preserve">    "lead_id": "YSC-20260908-7K3Q9F",</w:t>
       </w:r>
     </w:p>
     <w:p>
@@ -1446,6 +1478,74 @@
                 <w:szCs w:val="20"/>
               </w:rPr>
               <w:t xml:space="preserve">Notes</w:t>
+            </w:r>
+          </w:p>
+        </w:tc>
+      </w:tr>
+      <w:tr>
+        <w:tc>
+          <w:tcPr>
+            <w:tcW w:type="dxa" w:w="3200"/>
+            <w:tcBorders>
+              <w:top w:val="single" w:color="C6C7C8" w:sz="4"/>
+              <w:left w:val="single" w:color="C6C7C8" w:sz="4"/>
+              <w:bottom w:val="single" w:color="C6C7C8" w:sz="4"/>
+              <w:right w:val="single" w:color="C6C7C8" w:sz="4"/>
+            </w:tcBorders>
+            <w:tcMar>
+              <w:top w:type="dxa" w:w="80"/>
+              <w:left w:type="dxa" w:w="120"/>
+              <w:bottom w:type="dxa" w:w="80"/>
+              <w:right w:type="dxa" w:w="120"/>
+            </w:tcMar>
+          </w:tcPr>
+          <w:p>
+            <w:pPr>
+              <w:spacing w:after="0" w:line="260"/>
+            </w:pPr>
+            <w:r>
+              <w:rPr>
+                <w:rFonts w:ascii="Calibri" w:cs="Calibri" w:eastAsia="Calibri" w:hAnsi="Calibri"/>
+                <w:b w:val="false"/>
+                <w:bCs w:val="false"/>
+                <w:color w:val="111111"/>
+                <w:sz w:val="20"/>
+                <w:szCs w:val="20"/>
+              </w:rPr>
+              <w:t xml:space="preserve">lead_id</w:t>
+            </w:r>
+          </w:p>
+        </w:tc>
+        <w:tc>
+          <w:tcPr>
+            <w:tcW w:type="dxa" w:w="6400"/>
+            <w:tcBorders>
+              <w:top w:val="single" w:color="C6C7C8" w:sz="4"/>
+              <w:left w:val="single" w:color="C6C7C8" w:sz="4"/>
+              <w:bottom w:val="single" w:color="C6C7C8" w:sz="4"/>
+              <w:right w:val="single" w:color="C6C7C8" w:sz="4"/>
+            </w:tcBorders>
+            <w:tcMar>
+              <w:top w:type="dxa" w:w="80"/>
+              <w:left w:type="dxa" w:w="120"/>
+              <w:bottom w:type="dxa" w:w="80"/>
+              <w:right w:type="dxa" w:w="120"/>
+            </w:tcMar>
+          </w:tcPr>
+          <w:p>
+            <w:pPr>
+              <w:spacing w:after="0" w:line="260"/>
+            </w:pPr>
+            <w:r>
+              <w:rPr>
+                <w:rFonts w:ascii="Calibri" w:cs="Calibri" w:eastAsia="Calibri" w:hAnsi="Calibri"/>
+                <w:b w:val="false"/>
+                <w:bCs w:val="false"/>
+                <w:color w:val="111111"/>
+                <w:sz w:val="20"/>
+                <w:szCs w:val="20"/>
+              </w:rPr>
+              <w:t xml:space="preserve">Website-issued reference (YSC-YYYYMMDD-XXXXXX), unique per lead — please store it on the CRM record so leads can be reconciled with the business's own ledger</w:t>
             </w:r>
           </w:p>
         </w:tc>

</xml_diff>

<commit_message>
feat(leads): harden for concurrent submissions
- Lead reference random part widened to 8 characters (2^40 per day) so
  simultaneous submissions across independent serverless instances
  cannot collide in practice.
- Apps Script lock wait raised to 12 s (website waits 15 s); concurrent
  appends are serialised by the script-wide lock.
- Docs describe the concurrency model.

Verified: 12 visitors submitting at the same instant against delayed
mocks → 12 successes, 12 unique references, 12 CRM rows, 12 sheet rows,
all IDs consistent across CRM, sheet and UI, no cross-wired data.

Co-Authored-By: Claude Fable 5.1 <noreply@anthropic.com>
Claude-Session: https://claude.ai/code/session_01VrpQxTs5Qi8BMFcWT6GSTG
</commit_message>
<xml_diff>
--- a/docs/CRM_DEVELOPER_REQUIREMENTS.docx
+++ b/docs/CRM_DEVELOPER_REQUIREMENTS.docx
@@ -960,7 +960,7 @@
           <w:sz w:val="18"/>
           <w:szCs w:val="18"/>
         </w:rPr>
-        <w:t xml:space="preserve">  "lead_id": "YSC-20260908-7K3Q9F",</w:t>
+        <w:t xml:space="preserve">  "lead_id": "YSC-20260908-7K3Q9F2M",</w:t>
       </w:r>
     </w:p>
     <w:p>
@@ -1056,7 +1056,7 @@
           <w:sz w:val="18"/>
           <w:szCs w:val="18"/>
         </w:rPr>
-        <w:t xml:space="preserve">    "lead_id": "YSC-20260908-7K3Q9F",</w:t>
+        <w:t xml:space="preserve">    "lead_id": "YSC-20260908-7K3Q9F2M",</w:t>
       </w:r>
     </w:p>
     <w:p>
@@ -1545,7 +1545,7 @@
                 <w:sz w:val="20"/>
                 <w:szCs w:val="20"/>
               </w:rPr>
-              <w:t xml:space="preserve">Website-issued reference (YSC-YYYYMMDD-XXXXXX), unique per lead — please store it on the CRM record so leads can be reconciled with the business's own ledger</w:t>
+              <w:t xml:space="preserve">Website-issued reference (YSC-YYYYMMDD-XXXXXXXX), unique per lead — please store it on the CRM record so leads can be reconciled with the business's own ledger</w:t>
             </w:r>
           </w:p>
         </w:tc>

</xml_diff>